<commit_message>
fix(ledger): keep the cascade upstream-only
Skip the account's own repositories during merge discovery, drop the
seven self-repo rows that leaked in, and curate pytest-env#262 as a
thirteenth upstream merge.
</commit_message>
<xml_diff>
--- a/docs/generated/Devayan_Mandal-resume.docx
+++ b/docs/generated/Devayan_Mandal-resume.docx
@@ -81,7 +81,7 @@
           <w:szCs w:val="22"/>
           <w:rFonts w:ascii="Calibri" w:hAnsi="Calibri"/>
         </w:rPr>
-        <w:t xml:space="preserve">Full Stack AI Native / Forward Deployed AI Engineer with 10 years of remote, self-directed production work. Built 30+ production-grade systems across autonomous multi-agent platforms, MCP integrations, deterministic RL evaluation, real-time observability, and high-throughput web applications. Merged 20 upstream pull requests across TypeScript, JavaScript, Python, and Rust in Recharts, pnpm, node-postgres, SQLMesh, Biome, Better Auth, thirdweb, Anza Kit, and Rspress. Specializes in explicit state machines, bounded autonomy, verifiable AI systems, hybrid RAG and memory architectures, streaming infrastructure, and production-grade developer tooling, with end-to-end ownership from architecture through deployment, observability, testing, and upstream delivery.</w:t>
+        <w:t xml:space="preserve">Full Stack AI Native / Forward Deployed AI Engineer with 10 years of remote, self-directed production work. Built 30+ production-grade systems across autonomous multi-agent platforms, MCP integrations, deterministic RL evaluation, real-time observability, and high-throughput web applications. Merged 13 upstream pull requests across TypeScript, JavaScript, Python, and Rust in Recharts, pnpm, node-postgres, SQLMesh, Biome, Better Auth, thirdweb, Anza Kit, and Rspress. Specializes in explicit state machines, bounded autonomy, verifiable AI systems, hybrid RAG and memory architectures, streaming infrastructure, and production-grade developer tooling, with end-to-end ownership from architecture through deployment, observability, testing, and upstream delivery.</w:t>
       </w:r>
     </w:p>
     <w:p/>
@@ -551,7 +551,7 @@
           <w:szCs w:val="22"/>
           <w:rFonts w:ascii="Calibri" w:hAnsi="Calibri"/>
         </w:rPr>
-        <w:t xml:space="preserve">- pytest-dev/pytest-env #262 (TypeScript) - document [pytest] env configuration in pytest.toml / .pytest.toml Merged Sep 2026. github.com/pytest-dev/pytest-env/pull/262</w:t>
+        <w:t xml:space="preserve">- pytest-dev/pytest-env #262 (Python) - documented that pytest.toml and .pytest.toml accept the native [pytest] env table, not only the plugin-specific [pytest_env] section. Merged Sep 2026. github.com/pytest-dev/pytest-env/pull/262</w:t>
       </w:r>
     </w:p>
     <w:p>
@@ -708,97 +708,6 @@
           <w:rFonts w:ascii="Calibri" w:hAnsi="Calibri"/>
         </w:rPr>
         <w:t xml:space="preserve">- thirdweb-dev/js #8938 (TypeScript) - fixed useTokenQuery error handling so 401/429/timeout failures rethrow instead of rendering a false "Token Not Supported" state in CheckoutWidget; added tests and a patch changeset. Merged Sep 2026. github.com/thirdweb-dev/js/pull/8938</w:t>
-      </w:r>
-    </w:p>
-    <w:p>
-      <w:pPr>
-        <w:spacing w:after="80"/>
-      </w:pPr>
-      <w:r>
-        <w:rPr>
-          <w:sz w:val="22"/>
-          <w:szCs w:val="22"/>
-          <w:rFonts w:ascii="Calibri" w:hAnsi="Calibri"/>
-        </w:rPr>
-        <w:t xml:space="preserve">- devtechedge/regulatory_compliance #4 (TypeScript) - allow localhost API in CSP connect-src for e2e Merged Sep 2026. github.com/devtechedge/regulatory_compliance/pull/4</w:t>
-      </w:r>
-    </w:p>
-    <w:p>
-      <w:pPr>
-        <w:spacing w:after="80"/>
-      </w:pPr>
-      <w:r>
-        <w:rPr>
-          <w:sz w:val="22"/>
-          <w:szCs w:val="22"/>
-          <w:rFonts w:ascii="Calibri" w:hAnsi="Calibri"/>
-        </w:rPr>
-        <w:t xml:space="preserve">- devtechedge/regulatory_compliance #3 (TypeScript) - restore full data/ seed tree for backend + e2e Merged Sep 2026. github.com/devtechedge/regulatory_compliance/pull/3</w:t>
-      </w:r>
-    </w:p>
-    <w:p>
-      <w:pPr>
-        <w:spacing w:after="80"/>
-      </w:pPr>
-      <w:r>
-        <w:rPr>
-          <w:sz w:val="22"/>
-          <w:szCs w:val="22"/>
-          <w:rFonts w:ascii="Calibri" w:hAnsi="Calibri"/>
-        </w:rPr>
-        <w:t xml:space="preserve">- devtechedge/veritas-engine #3 (TypeScript) - drop CSP that broke next-dev Playwright e2e Merged Sep 2026. github.com/devtechedge/veritas-engine/pull/3</w:t>
-      </w:r>
-    </w:p>
-    <w:p>
-      <w:pPr>
-        <w:spacing w:after="80"/>
-      </w:pPr>
-      <w:r>
-        <w:rPr>
-          <w:sz w:val="22"/>
-          <w:szCs w:val="22"/>
-          <w:rFonts w:ascii="Calibri" w:hAnsi="Calibri"/>
-        </w:rPr>
-        <w:t xml:space="preserve">- devtechedge/luxe-tracker #7 (TypeScript) - actually remove double comma after typescript block Merged Sep 2026. github.com/devtechedge/luxe-tracker/pull/7</w:t>
-      </w:r>
-    </w:p>
-    <w:p>
-      <w:pPr>
-        <w:spacing w:after="80"/>
-      </w:pPr>
-      <w:r>
-        <w:rPr>
-          <w:sz w:val="22"/>
-          <w:szCs w:val="22"/>
-          <w:rFonts w:ascii="Calibri" w:hAnsi="Calibri"/>
-        </w:rPr>
-        <w:t xml:space="preserve">- devtechedge/aarop #2 (TypeScript) - drop CSP that broke next-dev Playwright e2e Merged Sep 2026. github.com/devtechedge/aarop/pull/2</w:t>
-      </w:r>
-    </w:p>
-    <w:p>
-      <w:pPr>
-        <w:spacing w:after="80"/>
-      </w:pPr>
-      <w:r>
-        <w:rPr>
-          <w:sz w:val="22"/>
-          <w:szCs w:val="22"/>
-          <w:rFonts w:ascii="Calibri" w:hAnsi="Calibri"/>
-        </w:rPr>
-        <w:t xml:space="preserve">- devtechedge/notion-clone #2 (TypeScript) - convert next.config.ts to next.config.mjs for Next 14 Merged Sep 2026. github.com/devtechedge/notion-clone/pull/2</w:t>
-      </w:r>
-    </w:p>
-    <w:p>
-      <w:pPr>
-        <w:spacing w:after="80"/>
-      </w:pPr>
-      <w:r>
-        <w:rPr>
-          <w:sz w:val="22"/>
-          <w:szCs w:val="22"/>
-          <w:rFonts w:ascii="Calibri" w:hAnsi="Calibri"/>
-        </w:rPr>
-        <w:t xml:space="preserve">- devtechedge/regulatory_compliance #2 (TypeScript) - array.from for Set + restore data/frameworks seed Merged Sep 2026. github.com/devtechedge/regulatory_compliance/pull/2</w:t>
       </w:r>
     </w:p>
     <w:p>

</xml_diff>